<commit_message>
Actualizacion de archivos Trabajo Practico word/pdf
</commit_message>
<xml_diff>
--- a/TRABAJO PRÁCTICO N° 1.docx
+++ b/TRABAJO PRÁCTICO N° 1.docx
@@ -4,82 +4,23 @@
   <w:body>
     <w:p>
       <w:pPr>
-        <w:pStyle w:val="Title"/>
-        <w:keepNext w:val="0"/>
-        <w:keepLines w:val="0"/>
-        <w:pageBreakBefore w:val="0"/>
-        <w:widowControl w:val="0"/>
-        <w:pBdr>
-          <w:top w:space="0" w:sz="0" w:val="nil"/>
-          <w:left w:space="0" w:sz="0" w:val="nil"/>
-          <w:bottom w:space="0" w:sz="0" w:val="nil"/>
-          <w:right w:space="0" w:sz="0" w:val="nil"/>
-          <w:between w:space="0" w:sz="0" w:val="nil"/>
-        </w:pBdr>
-        <w:shd w:fill="auto" w:val="clear"/>
-        <w:spacing w:after="0" w:before="0" w:line="276" w:lineRule="auto"/>
-        <w:ind w:left="0" w:right="0" w:firstLine="0"/>
-        <w:jc w:val="left"/>
-        <w:rPr>
-          <w:rFonts w:ascii="Arial" w:cs="Arial" w:eastAsia="Arial" w:hAnsi="Arial"/>
-          <w:b w:val="0"/>
-          <w:bCs w:val="0"/>
-          <w:i w:val="0"/>
-          <w:iCs w:val="0"/>
-          <w:smallCaps w:val="0"/>
-          <w:strike w:val="0"/>
-          <w:color w:val="000000"/>
-          <w:sz w:val="22"/>
-          <w:szCs w:val="22"/>
-          <w:u w:val="none"/>
-          <w:shd w:fill="auto" w:val="clear"/>
-          <w:vertAlign w:val="baseline"/>
-        </w:rPr>
-        <w:sectPr>
-          <w:pgSz w:h="15840" w:w="12240" w:orient="portrait"/>
-          <w:pgMar w:bottom="1440" w:top="1440" w:left="1440" w:right="1440" w:header="720" w:footer="720"/>
-          <w:pgNumType w:start="1"/>
-        </w:sectPr>
-      </w:pPr>
-      <w:bookmarkStart w:colFirst="0" w:colLast="0" w:name="_l03vq87uscfl" w:id="0"/>
-      <w:bookmarkEnd w:id="0"/>
-      <w:r>
-        <w:rPr>
-          <w:rFonts w:ascii="Arial" w:cs="Arial" w:eastAsia="Arial" w:hAnsi="Arial"/>
-          <w:b w:val="0"/>
-          <w:bCs w:val="0"/>
-          <w:i w:val="0"/>
-          <w:iCs w:val="0"/>
-          <w:smallCaps w:val="0"/>
-          <w:strike w:val="0"/>
-          <w:color w:val="000000"/>
-          <w:sz w:val="52"/>
-          <w:szCs w:val="52"/>
-          <w:u w:val="none"/>
-          <w:shd w:fill="auto" w:val="clear"/>
-          <w:vertAlign w:val="baseline"/>
-          <w:rtl w:val="0"/>
-        </w:rPr>
-        <w:t xml:space="preserve">Pestaña 1</w:t>
-      </w:r>
-      <w:r>
-        <w:rPr>
-          <w:rtl w:val="0"/>
-        </w:rPr>
-      </w:r>
-    </w:p>
-    <w:p>
-      <w:pPr>
         <w:pStyle w:val="Heading5"/>
         <w:keepNext w:val="0"/>
         <w:keepLines w:val="0"/>
-        <w:spacing w:before="2400" w:line="276" w:lineRule="auto"/>
-        <w:rPr/>
-      </w:pPr>
-      <w:bookmarkStart w:colFirst="0" w:colLast="0" w:name="_q12fdzk2qov6" w:id="1"/>
-      <w:bookmarkEnd w:id="1"/>
-      <w:r>
-        <w:rPr>
+        <w:spacing w:after="80" w:before="2400" w:line="276" w:lineRule="auto"/>
+        <w:rPr>
+          <w:b w:val="0"/>
+          <w:bCs w:val="0"/>
+          <w:color w:val="666666"/>
+        </w:rPr>
+      </w:pPr>
+      <w:bookmarkStart w:colFirst="0" w:colLast="0" w:name="_q12fdzk2qov6" w:id="0"/>
+      <w:bookmarkEnd w:id="0"/>
+      <w:r>
+        <w:rPr>
+          <w:b w:val="0"/>
+          <w:bCs w:val="0"/>
+          <w:color w:val="666666"/>
           <w:rtl w:val="0"/>
         </w:rPr>
         <w:t xml:space="preserve">TRABAJO PRÁCTICO N° 1</w:t>
@@ -100,18 +41,14 @@
         <w:spacing w:after="0" w:before="0" w:line="276" w:lineRule="auto"/>
         <w:ind w:right="6800"/>
         <w:rPr>
-          <w:b w:val="1"/>
-          <w:bCs w:val="1"/>
           <w:sz w:val="34"/>
           <w:szCs w:val="34"/>
         </w:rPr>
       </w:pPr>
-      <w:bookmarkStart w:colFirst="0" w:colLast="0" w:name="_q12fdzk2qov6" w:id="1"/>
-      <w:bookmarkEnd w:id="1"/>
-      <w:r>
-        <w:rPr>
-          <w:b w:val="1"/>
-          <w:bCs w:val="1"/>
+      <w:bookmarkStart w:colFirst="0" w:colLast="0" w:name="_q12fdzk2qov6" w:id="0"/>
+      <w:bookmarkEnd w:id="0"/>
+      <w:r>
+        <w:rPr>
           <w:sz w:val="34"/>
           <w:szCs w:val="34"/>
           <w:rtl w:val="0"/>
@@ -127,20 +64,16 @@
         <w:spacing w:after="0" w:line="276" w:lineRule="auto"/>
         <w:rPr>
           <w:rFonts w:ascii="Times New Roman" w:cs="Times New Roman" w:eastAsia="Times New Roman" w:hAnsi="Times New Roman"/>
-          <w:b w:val="1"/>
-          <w:bCs w:val="1"/>
           <w:color w:val="1b2a4a"/>
           <w:sz w:val="88"/>
           <w:szCs w:val="88"/>
         </w:rPr>
       </w:pPr>
-      <w:bookmarkStart w:colFirst="0" w:colLast="0" w:name="_q12fdzk2qov6" w:id="1"/>
-      <w:bookmarkEnd w:id="1"/>
+      <w:bookmarkStart w:colFirst="0" w:colLast="0" w:name="_q12fdzk2qov6" w:id="0"/>
+      <w:bookmarkEnd w:id="0"/>
       <w:r>
         <w:rPr>
           <w:rFonts w:ascii="Times New Roman" w:cs="Times New Roman" w:eastAsia="Times New Roman" w:hAnsi="Times New Roman"/>
-          <w:b w:val="1"/>
-          <w:bCs w:val="1"/>
           <w:color w:val="1b2a4a"/>
           <w:sz w:val="88"/>
           <w:szCs w:val="88"/>
@@ -157,20 +90,16 @@
         <w:spacing w:after="200" w:before="0" w:line="276" w:lineRule="auto"/>
         <w:rPr>
           <w:rFonts w:ascii="Times New Roman" w:cs="Times New Roman" w:eastAsia="Times New Roman" w:hAnsi="Times New Roman"/>
-          <w:b w:val="1"/>
-          <w:bCs w:val="1"/>
           <w:color w:val="009999"/>
           <w:sz w:val="88"/>
           <w:szCs w:val="88"/>
         </w:rPr>
       </w:pPr>
-      <w:bookmarkStart w:colFirst="0" w:colLast="0" w:name="_danc75dw45tv" w:id="2"/>
-      <w:bookmarkEnd w:id="2"/>
+      <w:bookmarkStart w:colFirst="0" w:colLast="0" w:name="_danc75dw45tv" w:id="1"/>
+      <w:bookmarkEnd w:id="1"/>
       <w:r>
         <w:rPr>
           <w:rFonts w:ascii="Times New Roman" w:cs="Times New Roman" w:eastAsia="Times New Roman" w:hAnsi="Times New Roman"/>
-          <w:b w:val="1"/>
-          <w:bCs w:val="1"/>
           <w:color w:val="009999"/>
           <w:sz w:val="88"/>
           <w:szCs w:val="88"/>
@@ -298,43 +227,88 @@
     <w:p>
       <w:pPr>
         <w:pStyle w:val="Heading6"/>
-        <w:spacing w:before="0" w:lineRule="auto"/>
-        <w:rPr/>
-      </w:pPr>
-      <w:bookmarkStart w:colFirst="0" w:colLast="0" w:name="_2yvgwydixjzz" w:id="3"/>
+        <w:spacing w:after="80" w:before="0" w:lineRule="auto"/>
+        <w:rPr>
+          <w:b w:val="0"/>
+          <w:bCs w:val="0"/>
+          <w:i w:val="1"/>
+          <w:iCs w:val="1"/>
+          <w:color w:val="666666"/>
+          <w:sz w:val="22"/>
+          <w:szCs w:val="22"/>
+        </w:rPr>
+      </w:pPr>
+      <w:bookmarkStart w:colFirst="0" w:colLast="0" w:name="_2yvgwydixjzz" w:id="2"/>
+      <w:bookmarkEnd w:id="2"/>
+      <w:r>
+        <w:rPr>
+          <w:b w:val="0"/>
+          <w:bCs w:val="0"/>
+          <w:i w:val="1"/>
+          <w:iCs w:val="1"/>
+          <w:color w:val="666666"/>
+          <w:sz w:val="22"/>
+          <w:szCs w:val="22"/>
+          <w:rtl w:val="0"/>
+        </w:rPr>
+        <w:t xml:space="preserve">DATOS DE LA ENTREGA:</w:t>
+      </w:r>
+    </w:p>
+    <w:p>
+      <w:pPr>
+        <w:pStyle w:val="Heading6"/>
+        <w:spacing w:after="80" w:before="0" w:lineRule="auto"/>
+        <w:rPr>
+          <w:b w:val="0"/>
+          <w:bCs w:val="0"/>
+          <w:i w:val="1"/>
+          <w:iCs w:val="1"/>
+          <w:color w:val="666666"/>
+          <w:sz w:val="22"/>
+          <w:szCs w:val="22"/>
+        </w:rPr>
+      </w:pPr>
+      <w:bookmarkStart w:colFirst="0" w:colLast="0" w:name="_za0u821wrr84" w:id="3"/>
       <w:bookmarkEnd w:id="3"/>
       <w:r>
         <w:rPr>
-          <w:rtl w:val="0"/>
-        </w:rPr>
-        <w:t xml:space="preserve">DATOS DE LA ENTREGA:</w:t>
+          <w:b w:val="0"/>
+          <w:bCs w:val="0"/>
+          <w:i w:val="1"/>
+          <w:iCs w:val="1"/>
+          <w:color w:val="666666"/>
+          <w:sz w:val="22"/>
+          <w:szCs w:val="22"/>
+          <w:rtl w:val="0"/>
+        </w:rPr>
+        <w:t xml:space="preserve">• Alumna:Cintia Soledad Juarez</w:t>
       </w:r>
     </w:p>
     <w:p>
       <w:pPr>
         <w:pStyle w:val="Heading6"/>
-        <w:spacing w:before="0" w:lineRule="auto"/>
-        <w:rPr/>
-      </w:pPr>
-      <w:bookmarkStart w:colFirst="0" w:colLast="0" w:name="_za0u821wrr84" w:id="4"/>
+        <w:spacing w:after="80" w:before="0" w:lineRule="auto"/>
+        <w:rPr>
+          <w:b w:val="0"/>
+          <w:bCs w:val="0"/>
+          <w:i w:val="1"/>
+          <w:iCs w:val="1"/>
+          <w:color w:val="666666"/>
+          <w:sz w:val="22"/>
+          <w:szCs w:val="22"/>
+        </w:rPr>
+      </w:pPr>
+      <w:bookmarkStart w:colFirst="0" w:colLast="0" w:name="_3fvqykf3b0jq" w:id="4"/>
       <w:bookmarkEnd w:id="4"/>
       <w:r>
         <w:rPr>
-          <w:rtl w:val="0"/>
-        </w:rPr>
-        <w:t xml:space="preserve">• Alumna:Cintia Soledad Juarez</w:t>
-      </w:r>
-    </w:p>
-    <w:p>
-      <w:pPr>
-        <w:pStyle w:val="Heading6"/>
-        <w:spacing w:before="0" w:lineRule="auto"/>
-        <w:rPr/>
-      </w:pPr>
-      <w:bookmarkStart w:colFirst="0" w:colLast="0" w:name="_3fvqykf3b0jq" w:id="5"/>
-      <w:bookmarkEnd w:id="5"/>
-      <w:r>
-        <w:rPr>
+          <w:b w:val="0"/>
+          <w:bCs w:val="0"/>
+          <w:i w:val="1"/>
+          <w:iCs w:val="1"/>
+          <w:color w:val="666666"/>
+          <w:sz w:val="22"/>
+          <w:szCs w:val="22"/>
           <w:rtl w:val="0"/>
         </w:rPr>
         <w:t xml:space="preserve">• Docente:Diego Mosquera </w:t>
@@ -345,28 +319,58 @@
     <w:p>
       <w:pPr>
         <w:pStyle w:val="Heading6"/>
-        <w:spacing w:before="0" w:lineRule="auto"/>
-        <w:rPr/>
-      </w:pPr>
-      <w:bookmarkStart w:colFirst="0" w:colLast="0" w:name="_5hzjaf5hoy1h" w:id="6"/>
+        <w:spacing w:after="80" w:before="0" w:lineRule="auto"/>
+        <w:rPr>
+          <w:b w:val="0"/>
+          <w:bCs w:val="0"/>
+          <w:i w:val="1"/>
+          <w:iCs w:val="1"/>
+          <w:color w:val="666666"/>
+          <w:sz w:val="22"/>
+          <w:szCs w:val="22"/>
+        </w:rPr>
+      </w:pPr>
+      <w:bookmarkStart w:colFirst="0" w:colLast="0" w:name="_5hzjaf5hoy1h" w:id="5"/>
+      <w:bookmarkEnd w:id="5"/>
+      <w:r>
+        <w:rPr>
+          <w:b w:val="0"/>
+          <w:bCs w:val="0"/>
+          <w:i w:val="1"/>
+          <w:iCs w:val="1"/>
+          <w:color w:val="666666"/>
+          <w:sz w:val="22"/>
+          <w:szCs w:val="22"/>
+          <w:rtl w:val="0"/>
+        </w:rPr>
+        <w:t xml:space="preserve">• Cuatrimestre / Año: 2° Cuatrimestre - 2026</w:t>
+      </w:r>
+    </w:p>
+    <w:p>
+      <w:pPr>
+        <w:pStyle w:val="Heading6"/>
+        <w:spacing w:after="80" w:before="0" w:lineRule="auto"/>
+        <w:rPr>
+          <w:b w:val="0"/>
+          <w:bCs w:val="0"/>
+          <w:i w:val="1"/>
+          <w:iCs w:val="1"/>
+          <w:color w:val="666666"/>
+          <w:sz w:val="22"/>
+          <w:szCs w:val="22"/>
+        </w:rPr>
+      </w:pPr>
+      <w:bookmarkStart w:colFirst="0" w:colLast="0" w:name="_l8dp1l7924ue" w:id="6"/>
       <w:bookmarkEnd w:id="6"/>
       <w:r>
         <w:rPr>
-          <w:rtl w:val="0"/>
-        </w:rPr>
-        <w:t xml:space="preserve">• Cuatrimestre / Año: 2° Cuatrimestre - 2026</w:t>
-      </w:r>
-    </w:p>
-    <w:p>
-      <w:pPr>
-        <w:pStyle w:val="Heading6"/>
-        <w:spacing w:before="0" w:lineRule="auto"/>
-        <w:rPr/>
-      </w:pPr>
-      <w:bookmarkStart w:colFirst="0" w:colLast="0" w:name="_l8dp1l7924ue" w:id="7"/>
-      <w:bookmarkEnd w:id="7"/>
-      <w:r>
-        <w:rPr>
+          <w:b w:val="0"/>
+          <w:bCs w:val="0"/>
+          <w:i w:val="1"/>
+          <w:iCs w:val="1"/>
+          <w:color w:val="666666"/>
+          <w:sz w:val="22"/>
+          <w:szCs w:val="22"/>
           <w:rtl w:val="0"/>
         </w:rPr>
         <w:t xml:space="preserve">• Repositorio del Proyecto: </w:t>
@@ -374,7 +378,13 @@
       <w:hyperlink r:id="rId6">
         <w:r>
           <w:rPr>
+            <w:b w:val="0"/>
+            <w:bCs w:val="0"/>
+            <w:i w:val="1"/>
+            <w:iCs w:val="1"/>
             <w:color w:val="1155cc"/>
+            <w:sz w:val="22"/>
+            <w:szCs w:val="22"/>
             <w:u w:val="single"/>
             <w:rtl w:val="0"/>
           </w:rPr>
@@ -383,6 +393,13 @@
       </w:hyperlink>
       <w:r>
         <w:rPr>
+          <w:b w:val="0"/>
+          <w:bCs w:val="0"/>
+          <w:i w:val="1"/>
+          <w:iCs w:val="1"/>
+          <w:color w:val="666666"/>
+          <w:sz w:val="22"/>
+          <w:szCs w:val="22"/>
           <w:rtl w:val="0"/>
         </w:rPr>
         <w:br w:type="textWrapping"/>
@@ -394,7 +411,13 @@
       <w:hyperlink r:id="rId7">
         <w:r>
           <w:rPr>
+            <w:b w:val="0"/>
+            <w:bCs w:val="0"/>
+            <w:i w:val="1"/>
+            <w:iCs w:val="1"/>
             <w:color w:val="1155cc"/>
+            <w:sz w:val="22"/>
+            <w:szCs w:val="22"/>
             <w:u w:val="single"/>
             <w:rtl w:val="0"/>
           </w:rPr>
@@ -403,6 +426,13 @@
       </w:hyperlink>
       <w:r>
         <w:rPr>
+          <w:b w:val="0"/>
+          <w:bCs w:val="0"/>
+          <w:i w:val="1"/>
+          <w:iCs w:val="1"/>
+          <w:color w:val="666666"/>
+          <w:sz w:val="22"/>
+          <w:szCs w:val="22"/>
           <w:rtl w:val="0"/>
         </w:rPr>
         <w:br w:type="textWrapping"/>
@@ -414,7 +444,13 @@
       <w:hyperlink r:id="rId8">
         <w:r>
           <w:rPr>
+            <w:b w:val="0"/>
+            <w:bCs w:val="0"/>
+            <w:i w:val="1"/>
+            <w:iCs w:val="1"/>
             <w:color w:val="1155cc"/>
+            <w:sz w:val="22"/>
+            <w:szCs w:val="22"/>
             <w:u w:val="single"/>
             <w:rtl w:val="0"/>
           </w:rPr>
@@ -430,11 +466,19 @@
     <w:p>
       <w:pPr>
         <w:pStyle w:val="Heading6"/>
-        <w:spacing w:before="0" w:lineRule="auto"/>
-        <w:rPr/>
-      </w:pPr>
-      <w:bookmarkStart w:colFirst="0" w:colLast="0" w:name="_6ywmeoyh9beg" w:id="8"/>
-      <w:bookmarkEnd w:id="8"/>
+        <w:spacing w:after="80" w:before="0" w:lineRule="auto"/>
+        <w:rPr>
+          <w:b w:val="0"/>
+          <w:bCs w:val="0"/>
+          <w:i w:val="1"/>
+          <w:iCs w:val="1"/>
+          <w:color w:val="666666"/>
+          <w:sz w:val="22"/>
+          <w:szCs w:val="22"/>
+        </w:rPr>
+      </w:pPr>
+      <w:bookmarkStart w:colFirst="0" w:colLast="0" w:name="_6ywmeoyh9beg" w:id="7"/>
+      <w:bookmarkEnd w:id="7"/>
       <w:r>
         <w:pict>
           <v:rect style="width:0.0pt;height:1.5pt" o:hr="t" o:hrstd="t" o:hralign="center" fillcolor="#A0A0A0" stroked="f"/>
@@ -449,11 +493,19 @@
     <w:p>
       <w:pPr>
         <w:pStyle w:val="Heading6"/>
-        <w:spacing w:before="0" w:lineRule="auto"/>
-        <w:rPr/>
-      </w:pPr>
-      <w:bookmarkStart w:colFirst="0" w:colLast="0" w:name="_ilmkxulcqaux" w:id="9"/>
-      <w:bookmarkEnd w:id="9"/>
+        <w:spacing w:after="80" w:before="0" w:lineRule="auto"/>
+        <w:rPr>
+          <w:b w:val="0"/>
+          <w:bCs w:val="0"/>
+          <w:i w:val="1"/>
+          <w:iCs w:val="1"/>
+          <w:color w:val="666666"/>
+          <w:sz w:val="22"/>
+          <w:szCs w:val="22"/>
+        </w:rPr>
+      </w:pPr>
+      <w:bookmarkStart w:colFirst="0" w:colLast="0" w:name="_ilmkxulcqaux" w:id="8"/>
+      <w:bookmarkEnd w:id="8"/>
       <w:r>
         <w:rPr>
           <w:rtl w:val="0"/>
@@ -492,20 +544,16 @@
         <w:spacing w:after="160" w:before="420" w:lineRule="auto"/>
         <w:rPr>
           <w:rFonts w:ascii="Times New Roman" w:cs="Times New Roman" w:eastAsia="Times New Roman" w:hAnsi="Times New Roman"/>
-          <w:b w:val="1"/>
-          <w:bCs w:val="1"/>
           <w:color w:val="009999"/>
           <w:sz w:val="34"/>
           <w:szCs w:val="34"/>
         </w:rPr>
       </w:pPr>
-      <w:bookmarkStart w:colFirst="0" w:colLast="0" w:name="_db4jgbr7557t" w:id="10"/>
-      <w:bookmarkEnd w:id="10"/>
+      <w:bookmarkStart w:colFirst="0" w:colLast="0" w:name="_db4jgbr7557t" w:id="9"/>
+      <w:bookmarkEnd w:id="9"/>
       <w:r>
         <w:rPr>
           <w:rFonts w:ascii="Times New Roman" w:cs="Times New Roman" w:eastAsia="Times New Roman" w:hAnsi="Times New Roman"/>
-          <w:b w:val="1"/>
-          <w:bCs w:val="1"/>
           <w:color w:val="1b2a4a"/>
           <w:sz w:val="34"/>
           <w:szCs w:val="34"/>
@@ -516,8 +564,6 @@
       <w:r>
         <w:rPr>
           <w:rFonts w:ascii="Times New Roman" w:cs="Times New Roman" w:eastAsia="Times New Roman" w:hAnsi="Times New Roman"/>
-          <w:b w:val="1"/>
-          <w:bCs w:val="1"/>
           <w:color w:val="b08d57"/>
           <w:sz w:val="34"/>
           <w:szCs w:val="34"/>
@@ -528,8 +574,6 @@
       <w:r>
         <w:rPr>
           <w:rFonts w:ascii="Times New Roman" w:cs="Times New Roman" w:eastAsia="Times New Roman" w:hAnsi="Times New Roman"/>
-          <w:b w:val="1"/>
-          <w:bCs w:val="1"/>
           <w:color w:val="009999"/>
           <w:sz w:val="34"/>
           <w:szCs w:val="34"/>
@@ -545,20 +589,15 @@
         <w:keepLines w:val="0"/>
         <w:spacing w:before="0" w:lineRule="auto"/>
         <w:rPr>
-          <w:b w:val="1"/>
-          <w:bCs w:val="1"/>
-          <w:color w:val="000000"/>
           <w:sz w:val="26"/>
           <w:szCs w:val="26"/>
         </w:rPr>
       </w:pPr>
-      <w:bookmarkStart w:colFirst="0" w:colLast="0" w:name="_cunqewx0xyer" w:id="11"/>
-      <w:bookmarkEnd w:id="11"/>
+      <w:bookmarkStart w:colFirst="0" w:colLast="0" w:name="_cunqewx0xyer" w:id="10"/>
+      <w:bookmarkEnd w:id="10"/>
       <w:r>
         <w:rPr>
           <w:rFonts w:ascii="Times New Roman" w:cs="Times New Roman" w:eastAsia="Times New Roman" w:hAnsi="Times New Roman"/>
-          <w:b w:val="1"/>
-          <w:bCs w:val="1"/>
           <w:color w:val="1b2a4a"/>
           <w:sz w:val="26"/>
           <w:szCs w:val="26"/>
@@ -618,20 +657,15 @@
         <w:keepLines w:val="0"/>
         <w:spacing w:before="0" w:lineRule="auto"/>
         <w:rPr>
-          <w:b w:val="1"/>
-          <w:bCs w:val="1"/>
-          <w:color w:val="000000"/>
           <w:sz w:val="26"/>
           <w:szCs w:val="26"/>
         </w:rPr>
       </w:pPr>
-      <w:bookmarkStart w:colFirst="0" w:colLast="0" w:name="_5par5synoo8c" w:id="12"/>
-      <w:bookmarkEnd w:id="12"/>
+      <w:bookmarkStart w:colFirst="0" w:colLast="0" w:name="_5par5synoo8c" w:id="11"/>
+      <w:bookmarkEnd w:id="11"/>
       <w:r>
         <w:rPr>
           <w:rFonts w:ascii="Times New Roman" w:cs="Times New Roman" w:eastAsia="Times New Roman" w:hAnsi="Times New Roman"/>
-          <w:b w:val="1"/>
-          <w:bCs w:val="1"/>
           <w:color w:val="1b2a4a"/>
           <w:sz w:val="26"/>
           <w:szCs w:val="26"/>
@@ -753,20 +787,15 @@
         <w:keepLines w:val="0"/>
         <w:spacing w:before="0" w:lineRule="auto"/>
         <w:rPr>
-          <w:b w:val="1"/>
-          <w:bCs w:val="1"/>
-          <w:color w:val="000000"/>
           <w:sz w:val="26"/>
           <w:szCs w:val="26"/>
         </w:rPr>
       </w:pPr>
-      <w:bookmarkStart w:colFirst="0" w:colLast="0" w:name="_pl32vyq51s9m" w:id="13"/>
-      <w:bookmarkEnd w:id="13"/>
+      <w:bookmarkStart w:colFirst="0" w:colLast="0" w:name="_pl32vyq51s9m" w:id="12"/>
+      <w:bookmarkEnd w:id="12"/>
       <w:r>
         <w:rPr>
           <w:rFonts w:ascii="Times New Roman" w:cs="Times New Roman" w:eastAsia="Times New Roman" w:hAnsi="Times New Roman"/>
-          <w:b w:val="1"/>
-          <w:bCs w:val="1"/>
           <w:color w:val="1b2a4a"/>
           <w:sz w:val="26"/>
           <w:szCs w:val="26"/>
@@ -856,20 +885,16 @@
         <w:spacing w:before="0" w:lineRule="auto"/>
         <w:rPr>
           <w:rFonts w:ascii="Times New Roman" w:cs="Times New Roman" w:eastAsia="Times New Roman" w:hAnsi="Times New Roman"/>
-          <w:b w:val="1"/>
-          <w:bCs w:val="1"/>
           <w:color w:val="1b2a4a"/>
           <w:sz w:val="26"/>
           <w:szCs w:val="26"/>
         </w:rPr>
       </w:pPr>
-      <w:bookmarkStart w:colFirst="0" w:colLast="0" w:name="_wdcl0uwsdv5n" w:id="14"/>
-      <w:bookmarkEnd w:id="14"/>
+      <w:bookmarkStart w:colFirst="0" w:colLast="0" w:name="_wdcl0uwsdv5n" w:id="13"/>
+      <w:bookmarkEnd w:id="13"/>
       <w:r>
         <w:rPr>
           <w:rFonts w:ascii="Times New Roman" w:cs="Times New Roman" w:eastAsia="Times New Roman" w:hAnsi="Times New Roman"/>
-          <w:b w:val="1"/>
-          <w:bCs w:val="1"/>
           <w:color w:val="1b2a4a"/>
           <w:sz w:val="26"/>
           <w:szCs w:val="26"/>
@@ -994,23 +1019,19 @@
         <w:pStyle w:val="Heading2"/>
         <w:keepNext w:val="0"/>
         <w:keepLines w:val="0"/>
-        <w:spacing w:after="80" w:before="0" w:lineRule="auto"/>
+        <w:spacing w:before="0" w:lineRule="auto"/>
         <w:rPr>
           <w:rFonts w:ascii="Times New Roman" w:cs="Times New Roman" w:eastAsia="Times New Roman" w:hAnsi="Times New Roman"/>
-          <w:b w:val="1"/>
-          <w:bCs w:val="1"/>
           <w:color w:val="009999"/>
           <w:sz w:val="34"/>
           <w:szCs w:val="34"/>
         </w:rPr>
       </w:pPr>
-      <w:bookmarkStart w:colFirst="0" w:colLast="0" w:name="_1txfdxgqwlt1" w:id="15"/>
-      <w:bookmarkEnd w:id="15"/>
+      <w:bookmarkStart w:colFirst="0" w:colLast="0" w:name="_1txfdxgqwlt1" w:id="14"/>
+      <w:bookmarkEnd w:id="14"/>
       <w:r>
         <w:rPr>
           <w:rFonts w:ascii="Times New Roman" w:cs="Times New Roman" w:eastAsia="Times New Roman" w:hAnsi="Times New Roman"/>
-          <w:b w:val="1"/>
-          <w:bCs w:val="1"/>
           <w:color w:val="1b2a4a"/>
           <w:sz w:val="34"/>
           <w:szCs w:val="34"/>
@@ -1021,8 +1042,6 @@
       <w:r>
         <w:rPr>
           <w:rFonts w:ascii="Times New Roman" w:cs="Times New Roman" w:eastAsia="Times New Roman" w:hAnsi="Times New Roman"/>
-          <w:b w:val="1"/>
-          <w:bCs w:val="1"/>
           <w:color w:val="009999"/>
           <w:sz w:val="34"/>
           <w:szCs w:val="34"/>
@@ -1232,19 +1251,17 @@
         <w:pStyle w:val="Heading2"/>
         <w:keepNext w:val="0"/>
         <w:keepLines w:val="0"/>
-        <w:spacing w:after="80" w:before="0" w:lineRule="auto"/>
-        <w:rPr>
-          <w:b w:val="1"/>
-          <w:bCs w:val="1"/>
-        </w:rPr>
-      </w:pPr>
-      <w:bookmarkStart w:colFirst="0" w:colLast="0" w:name="_padvo0l1pfo9" w:id="16"/>
-      <w:bookmarkEnd w:id="16"/>
+        <w:spacing w:before="0" w:lineRule="auto"/>
+        <w:rPr>
+          <w:sz w:val="32"/>
+          <w:szCs w:val="32"/>
+        </w:rPr>
+      </w:pPr>
+      <w:bookmarkStart w:colFirst="0" w:colLast="0" w:name="_padvo0l1pfo9" w:id="15"/>
+      <w:bookmarkEnd w:id="15"/>
       <w:r>
         <w:rPr>
           <w:rFonts w:ascii="Times New Roman" w:cs="Times New Roman" w:eastAsia="Times New Roman" w:hAnsi="Times New Roman"/>
-          <w:b w:val="1"/>
-          <w:bCs w:val="1"/>
           <w:color w:val="1b2a4a"/>
           <w:sz w:val="34"/>
           <w:szCs w:val="34"/>
@@ -1255,8 +1272,6 @@
       <w:r>
         <w:rPr>
           <w:rFonts w:ascii="Times New Roman" w:cs="Times New Roman" w:eastAsia="Times New Roman" w:hAnsi="Times New Roman"/>
-          <w:b w:val="1"/>
-          <w:bCs w:val="1"/>
           <w:color w:val="009999"/>
           <w:sz w:val="34"/>
           <w:szCs w:val="34"/>
@@ -1278,20 +1293,16 @@
         <w:spacing w:before="0" w:lineRule="auto"/>
         <w:rPr>
           <w:rFonts w:ascii="Times New Roman" w:cs="Times New Roman" w:eastAsia="Times New Roman" w:hAnsi="Times New Roman"/>
-          <w:b w:val="1"/>
-          <w:bCs w:val="1"/>
           <w:color w:val="1b2a4a"/>
           <w:sz w:val="26"/>
           <w:szCs w:val="26"/>
         </w:rPr>
       </w:pPr>
-      <w:bookmarkStart w:colFirst="0" w:colLast="0" w:name="_59c047tkoruf" w:id="17"/>
-      <w:bookmarkEnd w:id="17"/>
+      <w:bookmarkStart w:colFirst="0" w:colLast="0" w:name="_59c047tkoruf" w:id="16"/>
+      <w:bookmarkEnd w:id="16"/>
       <w:r>
         <w:rPr>
           <w:rFonts w:ascii="Times New Roman" w:cs="Times New Roman" w:eastAsia="Times New Roman" w:hAnsi="Times New Roman"/>
-          <w:b w:val="1"/>
-          <w:bCs w:val="1"/>
           <w:color w:val="1b2a4a"/>
           <w:sz w:val="26"/>
           <w:szCs w:val="26"/>
@@ -1308,15 +1319,13 @@
         <w:spacing w:before="0" w:lineRule="auto"/>
         <w:rPr>
           <w:rFonts w:ascii="Times New Roman" w:cs="Times New Roman" w:eastAsia="Times New Roman" w:hAnsi="Times New Roman"/>
-          <w:b w:val="1"/>
-          <w:bCs w:val="1"/>
           <w:color w:val="1b2a4a"/>
           <w:sz w:val="26"/>
           <w:szCs w:val="26"/>
         </w:rPr>
       </w:pPr>
-      <w:bookmarkStart w:colFirst="0" w:colLast="0" w:name="_qj52xki91q6c" w:id="18"/>
-      <w:bookmarkEnd w:id="18"/>
+      <w:bookmarkStart w:colFirst="0" w:colLast="0" w:name="_qj52xki91q6c" w:id="17"/>
+      <w:bookmarkEnd w:id="17"/>
       <w:r>
         <w:rPr>
           <w:rtl w:val="0"/>
@@ -2975,20 +2984,16 @@
         <w:spacing w:before="0" w:lineRule="auto"/>
         <w:rPr>
           <w:rFonts w:ascii="Times New Roman" w:cs="Times New Roman" w:eastAsia="Times New Roman" w:hAnsi="Times New Roman"/>
-          <w:b w:val="1"/>
-          <w:bCs w:val="1"/>
           <w:color w:val="1b2a4a"/>
           <w:sz w:val="26"/>
           <w:szCs w:val="26"/>
         </w:rPr>
       </w:pPr>
-      <w:bookmarkStart w:colFirst="0" w:colLast="0" w:name="_p9lwv5a2clq3" w:id="19"/>
-      <w:bookmarkEnd w:id="19"/>
+      <w:bookmarkStart w:colFirst="0" w:colLast="0" w:name="_p9lwv5a2clq3" w:id="18"/>
+      <w:bookmarkEnd w:id="18"/>
       <w:r>
         <w:rPr>
           <w:rFonts w:ascii="Times New Roman" w:cs="Times New Roman" w:eastAsia="Times New Roman" w:hAnsi="Times New Roman"/>
-          <w:b w:val="1"/>
-          <w:bCs w:val="1"/>
           <w:color w:val="1b2a4a"/>
           <w:sz w:val="26"/>
           <w:szCs w:val="26"/>
@@ -3137,23 +3142,19 @@
         <w:pStyle w:val="Heading2"/>
         <w:keepNext w:val="0"/>
         <w:keepLines w:val="0"/>
-        <w:spacing w:after="80" w:before="0" w:lineRule="auto"/>
+        <w:spacing w:before="0" w:lineRule="auto"/>
         <w:rPr>
           <w:rFonts w:ascii="Times New Roman" w:cs="Times New Roman" w:eastAsia="Times New Roman" w:hAnsi="Times New Roman"/>
-          <w:b w:val="1"/>
-          <w:bCs w:val="1"/>
           <w:color w:val="1b2a4a"/>
           <w:sz w:val="26"/>
           <w:szCs w:val="26"/>
         </w:rPr>
       </w:pPr>
-      <w:bookmarkStart w:colFirst="0" w:colLast="0" w:name="_7hw1l6mgeqlq" w:id="20"/>
-      <w:bookmarkEnd w:id="20"/>
+      <w:bookmarkStart w:colFirst="0" w:colLast="0" w:name="_7hw1l6mgeqlq" w:id="19"/>
+      <w:bookmarkEnd w:id="19"/>
       <w:r>
         <w:rPr>
           <w:rFonts w:ascii="Times New Roman" w:cs="Times New Roman" w:eastAsia="Times New Roman" w:hAnsi="Times New Roman"/>
-          <w:b w:val="1"/>
-          <w:bCs w:val="1"/>
           <w:color w:val="1b2a4a"/>
           <w:sz w:val="34"/>
           <w:szCs w:val="34"/>
@@ -3164,8 +3165,6 @@
       <w:r>
         <w:rPr>
           <w:rFonts w:ascii="Times New Roman" w:cs="Times New Roman" w:eastAsia="Times New Roman" w:hAnsi="Times New Roman"/>
-          <w:b w:val="1"/>
-          <w:bCs w:val="1"/>
           <w:color w:val="009999"/>
           <w:sz w:val="34"/>
           <w:szCs w:val="34"/>
@@ -3187,20 +3186,16 @@
         <w:spacing w:before="0" w:lineRule="auto"/>
         <w:rPr>
           <w:rFonts w:ascii="Times New Roman" w:cs="Times New Roman" w:eastAsia="Times New Roman" w:hAnsi="Times New Roman"/>
-          <w:b w:val="1"/>
-          <w:bCs w:val="1"/>
           <w:color w:val="1b2a4a"/>
           <w:sz w:val="26"/>
           <w:szCs w:val="26"/>
         </w:rPr>
       </w:pPr>
-      <w:bookmarkStart w:colFirst="0" w:colLast="0" w:name="_tntxpso6d24p" w:id="21"/>
-      <w:bookmarkEnd w:id="21"/>
+      <w:bookmarkStart w:colFirst="0" w:colLast="0" w:name="_tntxpso6d24p" w:id="20"/>
+      <w:bookmarkEnd w:id="20"/>
       <w:r>
         <w:rPr>
           <w:rFonts w:ascii="Times New Roman" w:cs="Times New Roman" w:eastAsia="Times New Roman" w:hAnsi="Times New Roman"/>
-          <w:b w:val="1"/>
-          <w:bCs w:val="1"/>
           <w:color w:val="1b2a4a"/>
           <w:sz w:val="26"/>
           <w:szCs w:val="26"/>
@@ -3211,7 +3206,8 @@
       </w:r>
       <w:r>
         <w:rPr>
-          <w:color w:val="000000"/>
+          <w:b w:val="0"/>
+          <w:bCs w:val="0"/>
           <w:sz w:val="22"/>
           <w:szCs w:val="22"/>
           <w:rtl w:val="0"/>
@@ -3221,8 +3217,6 @@
       <w:r>
         <w:rPr>
           <w:rFonts w:ascii="Times New Roman" w:cs="Times New Roman" w:eastAsia="Times New Roman" w:hAnsi="Times New Roman"/>
-          <w:b w:val="1"/>
-          <w:bCs w:val="1"/>
           <w:color w:val="1b2a4a"/>
           <w:sz w:val="26"/>
           <w:szCs w:val="26"/>
@@ -3455,23 +3449,19 @@
         <w:pStyle w:val="Heading2"/>
         <w:keepNext w:val="0"/>
         <w:keepLines w:val="0"/>
-        <w:spacing w:after="80" w:before="0" w:lineRule="auto"/>
+        <w:spacing w:before="0" w:lineRule="auto"/>
         <w:rPr>
           <w:rFonts w:ascii="Times New Roman" w:cs="Times New Roman" w:eastAsia="Times New Roman" w:hAnsi="Times New Roman"/>
-          <w:b w:val="1"/>
-          <w:bCs w:val="1"/>
           <w:color w:val="1b2a4a"/>
           <w:sz w:val="26"/>
           <w:szCs w:val="26"/>
         </w:rPr>
       </w:pPr>
-      <w:bookmarkStart w:colFirst="0" w:colLast="0" w:name="_yfu4w28r9la8" w:id="22"/>
-      <w:bookmarkEnd w:id="22"/>
+      <w:bookmarkStart w:colFirst="0" w:colLast="0" w:name="_yfu4w28r9la8" w:id="21"/>
+      <w:bookmarkEnd w:id="21"/>
       <w:r>
         <w:rPr>
           <w:rFonts w:ascii="Times New Roman" w:cs="Times New Roman" w:eastAsia="Times New Roman" w:hAnsi="Times New Roman"/>
-          <w:b w:val="1"/>
-          <w:bCs w:val="1"/>
           <w:color w:val="1b2a4a"/>
           <w:sz w:val="34"/>
           <w:szCs w:val="34"/>
@@ -3482,8 +3472,6 @@
       <w:r>
         <w:rPr>
           <w:rFonts w:ascii="Times New Roman" w:cs="Times New Roman" w:eastAsia="Times New Roman" w:hAnsi="Times New Roman"/>
-          <w:b w:val="1"/>
-          <w:bCs w:val="1"/>
           <w:color w:val="009999"/>
           <w:sz w:val="34"/>
           <w:szCs w:val="34"/>
@@ -3634,23 +3622,19 @@
         <w:pStyle w:val="Heading2"/>
         <w:keepNext w:val="0"/>
         <w:keepLines w:val="0"/>
-        <w:spacing w:after="80" w:before="0" w:lineRule="auto"/>
+        <w:spacing w:before="0" w:lineRule="auto"/>
         <w:rPr>
           <w:rFonts w:ascii="Times New Roman" w:cs="Times New Roman" w:eastAsia="Times New Roman" w:hAnsi="Times New Roman"/>
-          <w:b w:val="1"/>
-          <w:bCs w:val="1"/>
           <w:color w:val="009999"/>
           <w:sz w:val="34"/>
           <w:szCs w:val="34"/>
         </w:rPr>
       </w:pPr>
-      <w:bookmarkStart w:colFirst="0" w:colLast="0" w:name="_6ecfuox6pkmm" w:id="23"/>
-      <w:bookmarkEnd w:id="23"/>
+      <w:bookmarkStart w:colFirst="0" w:colLast="0" w:name="_6ecfuox6pkmm" w:id="22"/>
+      <w:bookmarkEnd w:id="22"/>
       <w:r>
         <w:rPr>
           <w:rFonts w:ascii="Times New Roman" w:cs="Times New Roman" w:eastAsia="Times New Roman" w:hAnsi="Times New Roman"/>
-          <w:b w:val="1"/>
-          <w:bCs w:val="1"/>
           <w:color w:val="1b2a4a"/>
           <w:sz w:val="34"/>
           <w:szCs w:val="34"/>
@@ -3661,8 +3645,6 @@
       <w:r>
         <w:rPr>
           <w:rFonts w:ascii="Times New Roman" w:cs="Times New Roman" w:eastAsia="Times New Roman" w:hAnsi="Times New Roman"/>
-          <w:b w:val="1"/>
-          <w:bCs w:val="1"/>
           <w:color w:val="009999"/>
           <w:sz w:val="34"/>
           <w:szCs w:val="34"/>
@@ -3679,20 +3661,16 @@
         <w:spacing w:before="0" w:lineRule="auto"/>
         <w:rPr>
           <w:rFonts w:ascii="Times New Roman" w:cs="Times New Roman" w:eastAsia="Times New Roman" w:hAnsi="Times New Roman"/>
-          <w:b w:val="1"/>
-          <w:bCs w:val="1"/>
           <w:color w:val="1b2a4a"/>
           <w:sz w:val="26"/>
           <w:szCs w:val="26"/>
         </w:rPr>
       </w:pPr>
-      <w:bookmarkStart w:colFirst="0" w:colLast="0" w:name="_94deyocm5jyo" w:id="24"/>
-      <w:bookmarkEnd w:id="24"/>
+      <w:bookmarkStart w:colFirst="0" w:colLast="0" w:name="_94deyocm5jyo" w:id="23"/>
+      <w:bookmarkEnd w:id="23"/>
       <w:r>
         <w:rPr>
           <w:rFonts w:ascii="Times New Roman" w:cs="Times New Roman" w:eastAsia="Times New Roman" w:hAnsi="Times New Roman"/>
-          <w:b w:val="1"/>
-          <w:bCs w:val="1"/>
           <w:color w:val="1b2a4a"/>
           <w:sz w:val="26"/>
           <w:szCs w:val="26"/>
@@ -4554,21 +4532,17 @@
         <w:pStyle w:val="Heading2"/>
         <w:keepNext w:val="0"/>
         <w:keepLines w:val="0"/>
-        <w:spacing w:after="80" w:before="0" w:lineRule="auto"/>
-        <w:rPr>
-          <w:b w:val="1"/>
-          <w:bCs w:val="1"/>
+        <w:spacing w:before="0" w:lineRule="auto"/>
+        <w:rPr>
           <w:sz w:val="34"/>
           <w:szCs w:val="34"/>
         </w:rPr>
       </w:pPr>
-      <w:bookmarkStart w:colFirst="0" w:colLast="0" w:name="_pb13ju2mqajx" w:id="25"/>
-      <w:bookmarkEnd w:id="25"/>
+      <w:bookmarkStart w:colFirst="0" w:colLast="0" w:name="_pb13ju2mqajx" w:id="24"/>
+      <w:bookmarkEnd w:id="24"/>
       <w:r>
         <w:rPr>
           <w:rFonts w:ascii="Times New Roman" w:cs="Times New Roman" w:eastAsia="Times New Roman" w:hAnsi="Times New Roman"/>
-          <w:b w:val="1"/>
-          <w:bCs w:val="1"/>
           <w:color w:val="1b2a4a"/>
           <w:sz w:val="34"/>
           <w:szCs w:val="34"/>
@@ -4579,8 +4553,6 @@
       <w:r>
         <w:rPr>
           <w:rFonts w:ascii="Times New Roman" w:cs="Times New Roman" w:eastAsia="Times New Roman" w:hAnsi="Times New Roman"/>
-          <w:b w:val="1"/>
-          <w:bCs w:val="1"/>
           <w:color w:val="009999"/>
           <w:sz w:val="34"/>
           <w:szCs w:val="34"/>
@@ -4602,20 +4574,16 @@
         <w:spacing w:before="0" w:lineRule="auto"/>
         <w:rPr>
           <w:rFonts w:ascii="Times New Roman" w:cs="Times New Roman" w:eastAsia="Times New Roman" w:hAnsi="Times New Roman"/>
-          <w:b w:val="1"/>
-          <w:bCs w:val="1"/>
           <w:color w:val="1b2a4a"/>
           <w:sz w:val="26"/>
           <w:szCs w:val="26"/>
         </w:rPr>
       </w:pPr>
-      <w:bookmarkStart w:colFirst="0" w:colLast="0" w:name="_ijik6xap633" w:id="26"/>
-      <w:bookmarkEnd w:id="26"/>
+      <w:bookmarkStart w:colFirst="0" w:colLast="0" w:name="_ijik6xap633" w:id="25"/>
+      <w:bookmarkEnd w:id="25"/>
       <w:r>
         <w:rPr>
           <w:rFonts w:ascii="Times New Roman" w:cs="Times New Roman" w:eastAsia="Times New Roman" w:hAnsi="Times New Roman"/>
-          <w:b w:val="1"/>
-          <w:bCs w:val="1"/>
           <w:color w:val="1b2a4a"/>
           <w:sz w:val="26"/>
           <w:szCs w:val="26"/>
@@ -4708,20 +4676,16 @@
         <w:spacing w:before="0" w:lineRule="auto"/>
         <w:rPr>
           <w:rFonts w:ascii="Times New Roman" w:cs="Times New Roman" w:eastAsia="Times New Roman" w:hAnsi="Times New Roman"/>
-          <w:b w:val="1"/>
-          <w:bCs w:val="1"/>
           <w:color w:val="1b2a4a"/>
           <w:sz w:val="26"/>
           <w:szCs w:val="26"/>
         </w:rPr>
       </w:pPr>
-      <w:bookmarkStart w:colFirst="0" w:colLast="0" w:name="_wf4wzn9mc3lg" w:id="27"/>
-      <w:bookmarkEnd w:id="27"/>
+      <w:bookmarkStart w:colFirst="0" w:colLast="0" w:name="_wf4wzn9mc3lg" w:id="26"/>
+      <w:bookmarkEnd w:id="26"/>
       <w:r>
         <w:rPr>
           <w:rFonts w:ascii="Times New Roman" w:cs="Times New Roman" w:eastAsia="Times New Roman" w:hAnsi="Times New Roman"/>
-          <w:b w:val="1"/>
-          <w:bCs w:val="1"/>
           <w:color w:val="1b2a4a"/>
           <w:sz w:val="26"/>
           <w:szCs w:val="26"/>
@@ -4785,20 +4749,15 @@
         <w:keepLines w:val="0"/>
         <w:spacing w:before="0" w:lineRule="auto"/>
         <w:rPr>
-          <w:b w:val="1"/>
-          <w:bCs w:val="1"/>
-          <w:color w:val="000000"/>
           <w:sz w:val="26"/>
           <w:szCs w:val="26"/>
         </w:rPr>
       </w:pPr>
-      <w:bookmarkStart w:colFirst="0" w:colLast="0" w:name="_kruk8jmh888m" w:id="28"/>
-      <w:bookmarkEnd w:id="28"/>
+      <w:bookmarkStart w:colFirst="0" w:colLast="0" w:name="_kruk8jmh888m" w:id="27"/>
+      <w:bookmarkEnd w:id="27"/>
       <w:r>
         <w:rPr>
           <w:rFonts w:ascii="Times New Roman" w:cs="Times New Roman" w:eastAsia="Times New Roman" w:hAnsi="Times New Roman"/>
-          <w:b w:val="1"/>
-          <w:bCs w:val="1"/>
           <w:color w:val="1b2a4a"/>
           <w:sz w:val="26"/>
           <w:szCs w:val="26"/>
@@ -4922,20 +4881,16 @@
         <w:spacing w:before="0" w:lineRule="auto"/>
         <w:rPr>
           <w:rFonts w:ascii="Times New Roman" w:cs="Times New Roman" w:eastAsia="Times New Roman" w:hAnsi="Times New Roman"/>
-          <w:b w:val="1"/>
-          <w:bCs w:val="1"/>
           <w:color w:val="1b2a4a"/>
           <w:sz w:val="26"/>
           <w:szCs w:val="26"/>
         </w:rPr>
       </w:pPr>
-      <w:bookmarkStart w:colFirst="0" w:colLast="0" w:name="_688pa881res0" w:id="29"/>
-      <w:bookmarkEnd w:id="29"/>
+      <w:bookmarkStart w:colFirst="0" w:colLast="0" w:name="_688pa881res0" w:id="28"/>
+      <w:bookmarkEnd w:id="28"/>
       <w:r>
         <w:rPr>
           <w:rFonts w:ascii="Times New Roman" w:cs="Times New Roman" w:eastAsia="Times New Roman" w:hAnsi="Times New Roman"/>
-          <w:b w:val="1"/>
-          <w:bCs w:val="1"/>
           <w:color w:val="1b2a4a"/>
           <w:sz w:val="26"/>
           <w:szCs w:val="26"/>
@@ -5070,21 +5025,17 @@
         <w:pStyle w:val="Heading2"/>
         <w:keepNext w:val="0"/>
         <w:keepLines w:val="0"/>
-        <w:spacing w:after="80" w:before="0" w:lineRule="auto"/>
-        <w:rPr>
-          <w:b w:val="1"/>
-          <w:bCs w:val="1"/>
+        <w:spacing w:before="0" w:lineRule="auto"/>
+        <w:rPr>
           <w:sz w:val="34"/>
           <w:szCs w:val="34"/>
         </w:rPr>
       </w:pPr>
-      <w:bookmarkStart w:colFirst="0" w:colLast="0" w:name="_wxj0qvfz0ve6" w:id="30"/>
-      <w:bookmarkEnd w:id="30"/>
+      <w:bookmarkStart w:colFirst="0" w:colLast="0" w:name="_wxj0qvfz0ve6" w:id="29"/>
+      <w:bookmarkEnd w:id="29"/>
       <w:r>
         <w:rPr>
           <w:rFonts w:ascii="Times New Roman" w:cs="Times New Roman" w:eastAsia="Times New Roman" w:hAnsi="Times New Roman"/>
-          <w:b w:val="1"/>
-          <w:bCs w:val="1"/>
           <w:color w:val="1b2a4a"/>
           <w:sz w:val="34"/>
           <w:szCs w:val="34"/>
@@ -5094,8 +5045,6 @@
       </w:r>
       <w:r>
         <w:rPr>
-          <w:b w:val="1"/>
-          <w:bCs w:val="1"/>
           <w:sz w:val="34"/>
           <w:szCs w:val="34"/>
           <w:rtl w:val="0"/>
@@ -5105,8 +5054,6 @@
       <w:r>
         <w:rPr>
           <w:rFonts w:ascii="Times New Roman" w:cs="Times New Roman" w:eastAsia="Times New Roman" w:hAnsi="Times New Roman"/>
-          <w:b w:val="1"/>
-          <w:bCs w:val="1"/>
           <w:color w:val="009999"/>
           <w:sz w:val="34"/>
           <w:szCs w:val="34"/>
@@ -5346,16 +5293,19 @@
         <w:pStyle w:val="Heading2"/>
         <w:keepNext w:val="0"/>
         <w:keepLines w:val="0"/>
-        <w:spacing w:after="80" w:before="0" w:lineRule="auto"/>
-        <w:rPr/>
-      </w:pPr>
-      <w:bookmarkStart w:colFirst="0" w:colLast="0" w:name="_rjzy5hmjc7is" w:id="31"/>
-      <w:bookmarkEnd w:id="31"/>
+        <w:spacing w:before="0" w:lineRule="auto"/>
+        <w:rPr>
+          <w:b w:val="0"/>
+          <w:bCs w:val="0"/>
+          <w:sz w:val="32"/>
+          <w:szCs w:val="32"/>
+        </w:rPr>
+      </w:pPr>
+      <w:bookmarkStart w:colFirst="0" w:colLast="0" w:name="_rjzy5hmjc7is" w:id="30"/>
+      <w:bookmarkEnd w:id="30"/>
       <w:r>
         <w:rPr>
           <w:rFonts w:ascii="Times New Roman" w:cs="Times New Roman" w:eastAsia="Times New Roman" w:hAnsi="Times New Roman"/>
-          <w:b w:val="1"/>
-          <w:bCs w:val="1"/>
           <w:color w:val="1b2a4a"/>
           <w:sz w:val="34"/>
           <w:szCs w:val="34"/>
@@ -5365,8 +5315,6 @@
       </w:r>
       <w:r>
         <w:rPr>
-          <w:b w:val="1"/>
-          <w:bCs w:val="1"/>
           <w:sz w:val="34"/>
           <w:szCs w:val="34"/>
           <w:rtl w:val="0"/>
@@ -5376,8 +5324,6 @@
       <w:r>
         <w:rPr>
           <w:rFonts w:ascii="Times New Roman" w:cs="Times New Roman" w:eastAsia="Times New Roman" w:hAnsi="Times New Roman"/>
-          <w:b w:val="1"/>
-          <w:bCs w:val="1"/>
           <w:color w:val="009999"/>
           <w:sz w:val="34"/>
           <w:szCs w:val="34"/>
@@ -5566,16 +5512,19 @@
         <w:pStyle w:val="Heading2"/>
         <w:keepNext w:val="0"/>
         <w:keepLines w:val="0"/>
-        <w:spacing w:after="80" w:before="0" w:lineRule="auto"/>
-        <w:rPr/>
-      </w:pPr>
-      <w:bookmarkStart w:colFirst="0" w:colLast="0" w:name="_mu5wt57bdh86" w:id="32"/>
-      <w:bookmarkEnd w:id="32"/>
+        <w:spacing w:before="0" w:lineRule="auto"/>
+        <w:rPr>
+          <w:b w:val="0"/>
+          <w:bCs w:val="0"/>
+          <w:sz w:val="32"/>
+          <w:szCs w:val="32"/>
+        </w:rPr>
+      </w:pPr>
+      <w:bookmarkStart w:colFirst="0" w:colLast="0" w:name="_mu5wt57bdh86" w:id="31"/>
+      <w:bookmarkEnd w:id="31"/>
       <w:r>
         <w:rPr>
           <w:rFonts w:ascii="Times New Roman" w:cs="Times New Roman" w:eastAsia="Times New Roman" w:hAnsi="Times New Roman"/>
-          <w:b w:val="1"/>
-          <w:bCs w:val="1"/>
           <w:color w:val="1b2a4a"/>
           <w:sz w:val="34"/>
           <w:szCs w:val="34"/>
@@ -5585,8 +5534,6 @@
       </w:r>
       <w:r>
         <w:rPr>
-          <w:b w:val="1"/>
-          <w:bCs w:val="1"/>
           <w:sz w:val="34"/>
           <w:szCs w:val="34"/>
           <w:rtl w:val="0"/>
@@ -5596,8 +5543,6 @@
       <w:r>
         <w:rPr>
           <w:rFonts w:ascii="Times New Roman" w:cs="Times New Roman" w:eastAsia="Times New Roman" w:hAnsi="Times New Roman"/>
-          <w:b w:val="1"/>
-          <w:bCs w:val="1"/>
           <w:color w:val="009999"/>
           <w:sz w:val="34"/>
           <w:szCs w:val="34"/>
@@ -5618,20 +5563,15 @@
         <w:keepLines w:val="0"/>
         <w:spacing w:before="0" w:lineRule="auto"/>
         <w:rPr>
-          <w:b w:val="1"/>
-          <w:bCs w:val="1"/>
-          <w:color w:val="000000"/>
           <w:sz w:val="26"/>
           <w:szCs w:val="26"/>
         </w:rPr>
       </w:pPr>
-      <w:bookmarkStart w:colFirst="0" w:colLast="0" w:name="_7oncoagkvnzu" w:id="33"/>
-      <w:bookmarkEnd w:id="33"/>
+      <w:bookmarkStart w:colFirst="0" w:colLast="0" w:name="_7oncoagkvnzu" w:id="32"/>
+      <w:bookmarkEnd w:id="32"/>
       <w:r>
         <w:rPr>
           <w:rFonts w:ascii="Times New Roman" w:cs="Times New Roman" w:eastAsia="Times New Roman" w:hAnsi="Times New Roman"/>
-          <w:b w:val="1"/>
-          <w:bCs w:val="1"/>
           <w:color w:val="1b2a4a"/>
           <w:sz w:val="26"/>
           <w:szCs w:val="26"/>
@@ -5700,20 +5640,15 @@
         <w:keepLines w:val="0"/>
         <w:spacing w:before="0" w:lineRule="auto"/>
         <w:rPr>
-          <w:b w:val="1"/>
-          <w:bCs w:val="1"/>
-          <w:color w:val="000000"/>
           <w:sz w:val="26"/>
           <w:szCs w:val="26"/>
         </w:rPr>
       </w:pPr>
-      <w:bookmarkStart w:colFirst="0" w:colLast="0" w:name="_d4fagg1ty071" w:id="34"/>
-      <w:bookmarkEnd w:id="34"/>
+      <w:bookmarkStart w:colFirst="0" w:colLast="0" w:name="_d4fagg1ty071" w:id="33"/>
+      <w:bookmarkEnd w:id="33"/>
       <w:r>
         <w:rPr>
           <w:rFonts w:ascii="Times New Roman" w:cs="Times New Roman" w:eastAsia="Times New Roman" w:hAnsi="Times New Roman"/>
-          <w:b w:val="1"/>
-          <w:bCs w:val="1"/>
           <w:color w:val="1b2a4a"/>
           <w:sz w:val="26"/>
           <w:szCs w:val="26"/>
@@ -5892,20 +5827,15 @@
         <w:keepLines w:val="0"/>
         <w:spacing w:before="0" w:lineRule="auto"/>
         <w:rPr>
-          <w:b w:val="1"/>
-          <w:bCs w:val="1"/>
-          <w:color w:val="000000"/>
           <w:sz w:val="26"/>
           <w:szCs w:val="26"/>
         </w:rPr>
       </w:pPr>
-      <w:bookmarkStart w:colFirst="0" w:colLast="0" w:name="_vuubsrp6ojmw" w:id="35"/>
-      <w:bookmarkEnd w:id="35"/>
+      <w:bookmarkStart w:colFirst="0" w:colLast="0" w:name="_vuubsrp6ojmw" w:id="34"/>
+      <w:bookmarkEnd w:id="34"/>
       <w:r>
         <w:rPr>
           <w:rFonts w:ascii="Times New Roman" w:cs="Times New Roman" w:eastAsia="Times New Roman" w:hAnsi="Times New Roman"/>
-          <w:b w:val="1"/>
-          <w:bCs w:val="1"/>
           <w:color w:val="1b2a4a"/>
           <w:sz w:val="26"/>
           <w:szCs w:val="26"/>
@@ -5956,16 +5886,19 @@
         <w:pStyle w:val="Heading2"/>
         <w:keepNext w:val="0"/>
         <w:keepLines w:val="0"/>
-        <w:spacing w:after="80" w:before="0" w:lineRule="auto"/>
-        <w:rPr/>
-      </w:pPr>
-      <w:bookmarkStart w:colFirst="0" w:colLast="0" w:name="_relxe2jzxd72" w:id="36"/>
-      <w:bookmarkEnd w:id="36"/>
+        <w:spacing w:before="0" w:lineRule="auto"/>
+        <w:rPr>
+          <w:b w:val="0"/>
+          <w:bCs w:val="0"/>
+          <w:sz w:val="32"/>
+          <w:szCs w:val="32"/>
+        </w:rPr>
+      </w:pPr>
+      <w:bookmarkStart w:colFirst="0" w:colLast="0" w:name="_relxe2jzxd72" w:id="35"/>
+      <w:bookmarkEnd w:id="35"/>
       <w:r>
         <w:rPr>
           <w:rFonts w:ascii="Times New Roman" w:cs="Times New Roman" w:eastAsia="Times New Roman" w:hAnsi="Times New Roman"/>
-          <w:b w:val="1"/>
-          <w:bCs w:val="1"/>
           <w:color w:val="1b2a4a"/>
           <w:sz w:val="34"/>
           <w:szCs w:val="34"/>
@@ -5975,8 +5908,6 @@
       </w:r>
       <w:r>
         <w:rPr>
-          <w:b w:val="1"/>
-          <w:bCs w:val="1"/>
           <w:sz w:val="34"/>
           <w:szCs w:val="34"/>
           <w:rtl w:val="0"/>
@@ -5986,8 +5917,6 @@
       <w:r>
         <w:rPr>
           <w:rFonts w:ascii="Times New Roman" w:cs="Times New Roman" w:eastAsia="Times New Roman" w:hAnsi="Times New Roman"/>
-          <w:b w:val="1"/>
-          <w:bCs w:val="1"/>
           <w:color w:val="009999"/>
           <w:sz w:val="34"/>
           <w:szCs w:val="34"/>
@@ -6008,20 +5937,15 @@
         <w:keepLines w:val="0"/>
         <w:spacing w:before="0" w:lineRule="auto"/>
         <w:rPr>
-          <w:b w:val="1"/>
-          <w:bCs w:val="1"/>
-          <w:color w:val="000000"/>
           <w:sz w:val="26"/>
           <w:szCs w:val="26"/>
         </w:rPr>
       </w:pPr>
-      <w:bookmarkStart w:colFirst="0" w:colLast="0" w:name="_p4hhz1329xq7" w:id="37"/>
-      <w:bookmarkEnd w:id="37"/>
+      <w:bookmarkStart w:colFirst="0" w:colLast="0" w:name="_p4hhz1329xq7" w:id="36"/>
+      <w:bookmarkEnd w:id="36"/>
       <w:r>
         <w:rPr>
           <w:rFonts w:ascii="Times New Roman" w:cs="Times New Roman" w:eastAsia="Times New Roman" w:hAnsi="Times New Roman"/>
-          <w:b w:val="1"/>
-          <w:bCs w:val="1"/>
           <w:color w:val="1b2a4a"/>
           <w:sz w:val="26"/>
           <w:szCs w:val="26"/>
@@ -6141,20 +6065,15 @@
         <w:keepLines w:val="0"/>
         <w:spacing w:before="0" w:lineRule="auto"/>
         <w:rPr>
-          <w:b w:val="1"/>
-          <w:bCs w:val="1"/>
-          <w:color w:val="000000"/>
           <w:sz w:val="26"/>
           <w:szCs w:val="26"/>
         </w:rPr>
       </w:pPr>
-      <w:bookmarkStart w:colFirst="0" w:colLast="0" w:name="_fn61gsr4k1tv" w:id="38"/>
-      <w:bookmarkEnd w:id="38"/>
+      <w:bookmarkStart w:colFirst="0" w:colLast="0" w:name="_fn61gsr4k1tv" w:id="37"/>
+      <w:bookmarkEnd w:id="37"/>
       <w:r>
         <w:rPr>
           <w:rFonts w:ascii="Times New Roman" w:cs="Times New Roman" w:eastAsia="Times New Roman" w:hAnsi="Times New Roman"/>
-          <w:b w:val="1"/>
-          <w:bCs w:val="1"/>
           <w:color w:val="1b2a4a"/>
           <w:sz w:val="26"/>
           <w:szCs w:val="26"/>
@@ -6198,6 +6117,30 @@
           <w:ilvl w:val="0"/>
           <w:numId w:val="1"/>
         </w:numPr>
+        <w:spacing w:after="0" w:afterAutospacing="0" w:lineRule="auto"/>
+        <w:ind w:left="720" w:hanging="360"/>
+      </w:pPr>
+      <w:r>
+        <w:rPr>
+          <w:b w:val="1"/>
+          <w:bCs w:val="1"/>
+          <w:rtl w:val="0"/>
+        </w:rPr>
+        <w:t xml:space="preserve">Almacenamiento (Data Lake):</w:t>
+      </w:r>
+      <w:r>
+        <w:rPr>
+          <w:rtl w:val="0"/>
+        </w:rPr>
+        <w:t xml:space="preserve"> Google Drive (carpetas Landing, Bronze, Silver, Gold y Checkpoints).</w:t>
+      </w:r>
+    </w:p>
+    <w:p>
+      <w:pPr>
+        <w:numPr>
+          <w:ilvl w:val="0"/>
+          <w:numId w:val="1"/>
+        </w:numPr>
         <w:spacing w:after="240" w:lineRule="auto"/>
         <w:ind w:left="720" w:hanging="360"/>
       </w:pPr>
@@ -6207,13 +6150,28 @@
           <w:bCs w:val="1"/>
           <w:rtl w:val="0"/>
         </w:rPr>
-        <w:t xml:space="preserve">Almacenamiento (Data Lake):</w:t>
-      </w:r>
-      <w:r>
-        <w:rPr>
-          <w:rtl w:val="0"/>
-        </w:rPr>
-        <w:t xml:space="preserve"> Google Drive (carpetas Landing, Bronze, Silver, Gold y Checkpoints).</w:t>
+        <w:t xml:space="preserve">Control de Versiones:</w:t>
+      </w:r>
+      <w:r>
+        <w:rPr>
+          <w:rtl w:val="0"/>
+        </w:rPr>
+        <w:t xml:space="preserve"> </w:t>
+      </w:r>
+      <w:hyperlink r:id="rId9">
+        <w:r>
+          <w:rPr>
+            <w:color w:val="1155cc"/>
+            <w:u w:val="single"/>
+            <w:rtl w:val="0"/>
+          </w:rPr>
+          <w:t xml:space="preserve">GitHub </w:t>
+        </w:r>
+      </w:hyperlink>
+      <w:r>
+        <w:rPr>
+          <w:rtl w:val="0"/>
+        </w:rPr>
       </w:r>
     </w:p>
     <w:p>
@@ -6233,16 +6191,19 @@
         <w:pStyle w:val="Heading2"/>
         <w:keepNext w:val="0"/>
         <w:keepLines w:val="0"/>
-        <w:spacing w:after="80" w:before="0" w:lineRule="auto"/>
-        <w:rPr/>
-      </w:pPr>
-      <w:bookmarkStart w:colFirst="0" w:colLast="0" w:name="_9e8vqvh5ard5" w:id="39"/>
-      <w:bookmarkEnd w:id="39"/>
+        <w:spacing w:before="0" w:lineRule="auto"/>
+        <w:rPr>
+          <w:b w:val="0"/>
+          <w:bCs w:val="0"/>
+          <w:sz w:val="32"/>
+          <w:szCs w:val="32"/>
+        </w:rPr>
+      </w:pPr>
+      <w:bookmarkStart w:colFirst="0" w:colLast="0" w:name="_9e8vqvh5ard5" w:id="38"/>
+      <w:bookmarkEnd w:id="38"/>
       <w:r>
         <w:rPr>
           <w:rFonts w:ascii="Times New Roman" w:cs="Times New Roman" w:eastAsia="Times New Roman" w:hAnsi="Times New Roman"/>
-          <w:b w:val="1"/>
-          <w:bCs w:val="1"/>
           <w:color w:val="1b2a4a"/>
           <w:sz w:val="34"/>
           <w:szCs w:val="34"/>
@@ -6252,8 +6213,6 @@
       </w:r>
       <w:r>
         <w:rPr>
-          <w:b w:val="1"/>
-          <w:bCs w:val="1"/>
           <w:sz w:val="34"/>
           <w:szCs w:val="34"/>
           <w:rtl w:val="0"/>
@@ -6263,8 +6222,6 @@
       <w:r>
         <w:rPr>
           <w:rFonts w:ascii="Times New Roman" w:cs="Times New Roman" w:eastAsia="Times New Roman" w:hAnsi="Times New Roman"/>
-          <w:b w:val="1"/>
-          <w:bCs w:val="1"/>
           <w:color w:val="009999"/>
           <w:sz w:val="34"/>
           <w:szCs w:val="34"/>
@@ -6295,7 +6252,7 @@
         <w:spacing w:after="240" w:lineRule="auto"/>
         <w:rPr/>
       </w:pPr>
-      <w:hyperlink r:id="rId9">
+      <w:hyperlink r:id="rId10">
         <w:r>
           <w:rPr>
             <w:color w:val="1155cc"/>
@@ -6349,7 +6306,6 @@
       </w:r>
     </w:p>
     <w:sectPr>
-      <w:type w:val="nextPage"/>
       <w:pgSz w:h="15840" w:w="12240" w:orient="portrait"/>
       <w:pgMar w:bottom="1440" w:top="1440" w:left="1440" w:right="1440" w:header="720" w:footer="720"/>
       <w:pgNumType w:start="1"/>

</xml_diff>